<commit_message>
Finished Q2. Added .mzn file.
</commit_message>
<xml_diff>
--- a/Assignment3/CMSC4200_Assignment3.docx
+++ b/Assignment3/CMSC4200_Assignment3.docx
@@ -1661,10 +1661,7 @@
               <w:jc w:val="both"/>
             </w:pPr>
             <w:r>
-              <w:t>CMSC</w:t>
-            </w:r>
-            <w:r>
-              <w:t xml:space="preserve"> Class 1:</w:t>
+              <w:t>CMSC Class 1:</w:t>
             </w:r>
           </w:p>
         </w:tc>
@@ -1692,16 +1689,7 @@
               <w:jc w:val="both"/>
             </w:pPr>
             <w:r>
-              <w:t xml:space="preserve"> CMSC </w:t>
-            </w:r>
-            <w:r>
-              <w:t>Class</w:t>
-            </w:r>
-            <w:r>
-              <w:t xml:space="preserve"> 2</w:t>
-            </w:r>
-            <w:r>
-              <w:t>:</w:t>
+              <w:t xml:space="preserve"> CMSC Class 2:</w:t>
             </w:r>
           </w:p>
         </w:tc>
@@ -1795,10 +1783,7 @@
               <w:jc w:val="both"/>
             </w:pPr>
             <w:r>
-              <w:t>Prof</w:t>
-            </w:r>
-            <w:r>
-              <w:t>2</w:t>
+              <w:t>Prof2</w:t>
             </w:r>
           </w:p>
         </w:tc>
@@ -1868,10 +1853,7 @@
               <w:jc w:val="both"/>
             </w:pPr>
             <w:r>
-              <w:t>Prof</w:t>
-            </w:r>
-            <w:r>
-              <w:t>3</w:t>
+              <w:t>Prof3</w:t>
             </w:r>
           </w:p>
         </w:tc>
@@ -1941,10 +1923,7 @@
               <w:jc w:val="both"/>
             </w:pPr>
             <w:r>
-              <w:t>Prof</w:t>
-            </w:r>
-            <w:r>
-              <w:t>4</w:t>
+              <w:t>Prof4</w:t>
             </w:r>
           </w:p>
         </w:tc>
@@ -2113,22 +2092,7 @@
         <w:t xml:space="preserve"> </w:t>
       </w:r>
       <w:r>
-        <w:t>Professor</w:t>
-      </w:r>
-      <w:r>
-        <w:t xml:space="preserve">2, </w:t>
-      </w:r>
-      <w:r>
-        <w:t>Professor</w:t>
-      </w:r>
-      <w:r>
-        <w:t xml:space="preserve">3, </w:t>
-      </w:r>
-      <w:r>
-        <w:t>Professor</w:t>
-      </w:r>
-      <w:r>
-        <w:t xml:space="preserve">4 </w:t>
+        <w:t xml:space="preserve">Professor2, Professor3, Professor4 </w:t>
       </w:r>
       <w:r>
         <w:t>}</w:t>
@@ -2178,10 +2142,7 @@
         <w:t xml:space="preserve"> </w:t>
       </w:r>
       <w:r>
-        <w:t>TU8:00-9:15AM, TU9:30-10:45AM, TU12:30-1:45PM, TU2:00-3:15PM</w:t>
-      </w:r>
-      <w:r>
-        <w:t xml:space="preserve"> }</w:t>
+        <w:t>TU8:00-9:15AM, TU9:30-10:45AM, TU12:30-1:45PM, TU2:00-3:15PM }</w:t>
       </w:r>
     </w:p>
     <w:p>
@@ -2216,13 +2177,7 @@
               <w:rPr>
                 <w:rFonts w:ascii="Cambria Math" w:hAnsi="Cambria Math"/>
               </w:rPr>
-              <m:t xml:space="preserve">CMSC </m:t>
-            </m:r>
-            <m:r>
-              <w:rPr>
-                <w:rFonts w:ascii="Cambria Math" w:hAnsi="Cambria Math"/>
-              </w:rPr>
-              <m:t>class</m:t>
+              <m:t>CMSC class</m:t>
             </m:r>
           </m:sub>
         </m:sSub>
@@ -2296,12 +2251,24 @@
         <w:t xml:space="preserve">= { </w:t>
       </w:r>
       <w:r>
-        <w:t>Professor1</w:t>
+        <w:t xml:space="preserve">Professor1 </w:t>
+      </w:r>
+      <w:r>
+        <w:rPr>
+          <w:rFonts w:cstheme="minorHAnsi"/>
+        </w:rPr>
+        <w:t>≠</w:t>
       </w:r>
       <w:r>
         <w:t xml:space="preserve"> </w:t>
       </w:r>
       <w:r>
+        <w:t xml:space="preserve">8:00-9:15am, </w:t>
+      </w:r>
+      <w:r>
+        <w:t xml:space="preserve">Professor2 </w:t>
+      </w:r>
+      <w:r>
         <w:rPr>
           <w:rFonts w:cstheme="minorHAnsi"/>
         </w:rPr>
@@ -2311,31 +2278,7 @@
         <w:t xml:space="preserve"> </w:t>
       </w:r>
       <w:r>
-        <w:t>8:00-9:15am</w:t>
-      </w:r>
-      <w:r>
-        <w:t xml:space="preserve">, </w:t>
-      </w:r>
-      <w:r>
-        <w:t>Professor</w:t>
-      </w:r>
-      <w:r>
-        <w:t xml:space="preserve">2 </w:t>
-      </w:r>
-      <w:r>
-        <w:rPr>
-          <w:rFonts w:cstheme="minorHAnsi"/>
-        </w:rPr>
-        <w:t>≠</w:t>
-      </w:r>
-      <w:r>
-        <w:t xml:space="preserve"> </w:t>
-      </w:r>
-      <w:r>
-        <w:t>2:00-3:15pm</w:t>
-      </w:r>
-      <w:r>
-        <w:t>}</w:t>
+        <w:t>2:00-3:15pm}</w:t>
       </w:r>
     </w:p>
     <w:p>
@@ -2391,10 +2334,7 @@
         <w:t xml:space="preserve"> </w:t>
       </w:r>
       <w:r>
-        <w:t xml:space="preserve">Professor 1 </w:t>
-      </w:r>
-      <w:r>
-        <w:t xml:space="preserve">= </w:t>
+        <w:t xml:space="preserve">Professor 1 = </w:t>
       </w:r>
       <w:r>
         <w:rPr>
@@ -2452,73 +2392,55 @@
         <w:rPr>
           <w:rFonts w:eastAsiaTheme="minorEastAsia"/>
         </w:rPr>
-        <w:t xml:space="preserve">         </w:t>
+        <w:t xml:space="preserve">         (</w:t>
+      </w:r>
+      <w:r>
+        <w:t xml:space="preserve"> </w:t>
+      </w:r>
+      <w:r>
+        <w:t xml:space="preserve">Professor 2 = </w:t>
+      </w:r>
+      <w:r>
+        <w:rPr>
+          <w:highlight w:val="green"/>
+        </w:rPr>
+        <w:t>CMSC1200</w:t>
+      </w:r>
+      <w:r>
+        <w:t xml:space="preserve">, </w:t>
+      </w:r>
+      <w:r>
+        <w:rPr>
+          <w:highlight w:val="cyan"/>
+        </w:rPr>
+        <w:t>CMSC1240</w:t>
+      </w:r>
+      <w:r>
+        <w:t xml:space="preserve">, </w:t>
+      </w:r>
+      <w:r>
+        <w:rPr>
+          <w:highlight w:val="magenta"/>
+        </w:rPr>
+        <w:t>CMSC3040</w:t>
+      </w:r>
+      <w:r>
+        <w:t>, CMSC3140,</w:t>
+      </w:r>
+      <w:r>
+        <w:t xml:space="preserve"> </w:t>
+      </w:r>
+      <w:r>
+        <w:rPr>
+          <w:highlight w:val="blue"/>
+        </w:rPr>
+        <w:t>CMSC4000</w:t>
       </w:r>
       <w:r>
         <w:rPr>
           <w:rFonts w:eastAsiaTheme="minorEastAsia"/>
         </w:rPr>
-        <w:t>(</w:t>
-      </w:r>
-      <w:r>
-        <w:t xml:space="preserve"> </w:t>
-      </w:r>
-      <w:r>
-        <w:t xml:space="preserve">Professor </w:t>
-      </w:r>
-      <w:r>
-        <w:t>2</w:t>
-      </w:r>
-      <w:r>
-        <w:t xml:space="preserve"> = </w:t>
-      </w:r>
-      <w:r>
-        <w:rPr>
-          <w:highlight w:val="green"/>
-        </w:rPr>
-        <w:t>CMSC1200</w:t>
-      </w:r>
-      <w:r>
-        <w:t xml:space="preserve">, </w:t>
-      </w:r>
-      <w:r>
-        <w:rPr>
-          <w:highlight w:val="cyan"/>
-        </w:rPr>
-        <w:t>CMSC1240</w:t>
-      </w:r>
-      <w:r>
-        <w:t xml:space="preserve">, </w:t>
-      </w:r>
-      <w:r>
-        <w:rPr>
-          <w:highlight w:val="magenta"/>
-        </w:rPr>
-        <w:t>CMSC3040</w:t>
-      </w:r>
-      <w:r>
-        <w:t>, CMSC3140,</w:t>
-      </w:r>
-      <w:r>
-        <w:t xml:space="preserve"> </w:t>
-      </w:r>
-      <w:r>
-        <w:rPr>
-          <w:highlight w:val="blue"/>
-        </w:rPr>
-        <w:t>CMSC4000</w:t>
-      </w:r>
-      <w:r>
-        <w:rPr>
-          <w:rFonts w:eastAsiaTheme="minorEastAsia"/>
-        </w:rPr>
-        <w:t>)</w:t>
-      </w:r>
-      <w:r>
-        <w:rPr>
-          <w:rFonts w:eastAsiaTheme="minorEastAsia"/>
-        </w:rPr>
-        <w:t>,</w:t>
+        <w:t>),</w:t>
       </w:r>
     </w:p>
     <w:p>
@@ -2540,13 +2462,7 @@
         <w:t xml:space="preserve"> </w:t>
       </w:r>
       <w:r>
-        <w:t xml:space="preserve">Professor </w:t>
-      </w:r>
-      <w:r>
-        <w:t>3</w:t>
-      </w:r>
-      <w:r>
-        <w:t xml:space="preserve"> =</w:t>
+        <w:t>Professor 3 =</w:t>
       </w:r>
       <w:r>
         <w:rPr>
@@ -2573,13 +2489,7 @@
         <w:rPr>
           <w:rFonts w:eastAsiaTheme="minorEastAsia"/>
         </w:rPr>
-        <w:t>)</w:t>
-      </w:r>
-      <w:r>
-        <w:rPr>
-          <w:rFonts w:eastAsiaTheme="minorEastAsia"/>
-        </w:rPr>
-        <w:t>,</w:t>
+        <w:t>),</w:t>
       </w:r>
     </w:p>
     <w:p>
@@ -2601,13 +2511,7 @@
         <w:t xml:space="preserve"> </w:t>
       </w:r>
       <w:r>
-        <w:t xml:space="preserve">Professor </w:t>
-      </w:r>
-      <w:r>
-        <w:t>4</w:t>
-      </w:r>
-      <w:r>
-        <w:t xml:space="preserve"> =</w:t>
+        <w:t>Professor 4 =</w:t>
       </w:r>
       <w:r>
         <w:rPr>
@@ -2800,49 +2704,7 @@
           <w:i/>
           <w:iCs/>
         </w:rPr>
-        <w:t xml:space="preserve"> {Professor, (time1, class1) </w:t>
-      </w:r>
-      <w:r>
-        <w:rPr>
-          <w:i/>
-          <w:iCs/>
-        </w:rPr>
-        <w:t>(time</w:t>
-      </w:r>
-      <w:r>
-        <w:rPr>
-          <w:i/>
-          <w:iCs/>
-        </w:rPr>
-        <w:t>2</w:t>
-      </w:r>
-      <w:r>
-        <w:rPr>
-          <w:i/>
-          <w:iCs/>
-        </w:rPr>
-        <w:t>, class</w:t>
-      </w:r>
-      <w:r>
-        <w:rPr>
-          <w:i/>
-          <w:iCs/>
-        </w:rPr>
-        <w:t>2</w:t>
-      </w:r>
-      <w:r>
-        <w:rPr>
-          <w:i/>
-          <w:iCs/>
-        </w:rPr>
-        <w:t>)</w:t>
-      </w:r>
-      <w:r>
-        <w:rPr>
-          <w:i/>
-          <w:iCs/>
-        </w:rPr>
-        <w:t>}</w:t>
+        <w:t xml:space="preserve"> {Professor, (time1, class1) (time2, class2)}</w:t>
       </w:r>
     </w:p>
     <w:p>
@@ -2898,13 +2760,7 @@
         <w:t>:</w:t>
       </w:r>
       <w:r>
-        <w:t xml:space="preserve"> (</w:t>
-      </w:r>
-      <w:r>
-        <w:t>9:30-10:45</w:t>
-      </w:r>
-      <w:r>
-        <w:t xml:space="preserve">am, </w:t>
+        <w:t xml:space="preserve"> (9:30-10:45am, </w:t>
       </w:r>
       <w:r>
         <w:t xml:space="preserve"> </w:t>
@@ -2922,13 +2778,7 @@
         <w:t xml:space="preserve"> </w:t>
       </w:r>
       <w:r>
-        <w:t>(</w:t>
-      </w:r>
-      <w:r>
-        <w:t>2:00-3:15pm</w:t>
-      </w:r>
-      <w:r>
-        <w:t xml:space="preserve">, </w:t>
+        <w:t xml:space="preserve">(2:00-3:15pm, </w:t>
       </w:r>
       <w:r>
         <w:rPr>
@@ -2962,13 +2812,7 @@
         <w:t xml:space="preserve"> 3140</w:t>
       </w:r>
       <w:r>
-        <w:t>) (</w:t>
-      </w:r>
-      <w:r>
-        <w:t>9:30-10:45</w:t>
-      </w:r>
-      <w:r>
-        <w:t>am,</w:t>
+        <w:t>) (9:30-10:45am,</w:t>
       </w:r>
       <w:r>
         <w:rPr>
@@ -2991,8 +2835,6 @@
       </w:r>
       <w:r>
         <w:tab/>
-      </w:r>
-      <w:r>
         <w:t xml:space="preserve"> Professor</w:t>
       </w:r>
       <w:r>
@@ -3005,31 +2847,22 @@
         <w:t xml:space="preserve">: </w:t>
       </w:r>
       <w:r>
+        <w:t>(9:30-10:45am,</w:t>
+      </w:r>
+      <w:r>
+        <w:t xml:space="preserve"> 3100</w:t>
+      </w:r>
+      <w:r>
+        <w:t>)</w:t>
+      </w:r>
+      <w:r>
+        <w:t xml:space="preserve"> </w:t>
+      </w:r>
+      <w:r>
         <w:t>(</w:t>
       </w:r>
       <w:r>
-        <w:t>9:30-10:45</w:t>
-      </w:r>
-      <w:r>
-        <w:t>am,</w:t>
-      </w:r>
-      <w:r>
-        <w:t xml:space="preserve"> 3100</w:t>
-      </w:r>
-      <w:r>
-        <w:t>)</w:t>
-      </w:r>
-      <w:r>
-        <w:t xml:space="preserve"> </w:t>
-      </w:r>
-      <w:r>
-        <w:t>(</w:t>
-      </w:r>
-      <w:r>
-        <w:t>12:30-1:45</w:t>
-      </w:r>
-      <w:r>
-        <w:t>pm,</w:t>
+        <w:t>12:30-1:45pm,</w:t>
       </w:r>
       <w:r>
         <w:rPr>
@@ -3052,49 +2885,40 @@
       </w:r>
       <w:r>
         <w:tab/>
+        <w:t xml:space="preserve"> Professor</w:t>
+      </w:r>
+      <w:r>
         <w:t xml:space="preserve"> </w:t>
       </w:r>
       <w:r>
-        <w:t>Professor</w:t>
+        <w:t>4</w:t>
+      </w:r>
+      <w:r>
+        <w:t xml:space="preserve">: </w:t>
+      </w:r>
+      <w:r>
+        <w:t>(</w:t>
+      </w:r>
+      <w:r>
+        <w:t>12:30-1:45pm</w:t>
+      </w:r>
+      <w:r>
+        <w:t>,</w:t>
+      </w:r>
+      <w:r>
+        <w:t xml:space="preserve"> 2040</w:t>
+      </w:r>
+      <w:r>
+        <w:t>)</w:t>
       </w:r>
       <w:r>
         <w:t xml:space="preserve"> </w:t>
       </w:r>
       <w:r>
-        <w:t>4</w:t>
-      </w:r>
-      <w:r>
-        <w:t xml:space="preserve">: </w:t>
-      </w:r>
-      <w:r>
         <w:t>(</w:t>
       </w:r>
       <w:r>
-        <w:t>12:30-1:45</w:t>
-      </w:r>
-      <w:r>
-        <w:t>pm</w:t>
-      </w:r>
-      <w:r>
-        <w:t>,</w:t>
-      </w:r>
-      <w:r>
-        <w:t xml:space="preserve"> 2040</w:t>
-      </w:r>
-      <w:r>
-        <w:t>)</w:t>
-      </w:r>
-      <w:r>
-        <w:t xml:space="preserve"> </w:t>
-      </w:r>
-      <w:r>
-        <w:t>(</w:t>
-      </w:r>
-      <w:r>
-        <w:t>2:00-3:15pm</w:t>
-      </w:r>
-      <w:r>
-        <w:t>,</w:t>
+        <w:t>2:00-3:15pm,</w:t>
       </w:r>
       <w:r>
         <w:rPr>
@@ -3160,102 +2984,79 @@
         <w:t>Write a</w:t>
       </w:r>
       <w:r>
+        <w:t xml:space="preserve"> M</w:t>
+      </w:r>
+      <w:r>
+        <w:t>ini</w:t>
+      </w:r>
+      <w:r>
+        <w:t>Z</w:t>
+      </w:r>
+      <w:r>
+        <w:t>inc</w:t>
+      </w:r>
+      <w:r>
+        <w:t xml:space="preserve"> program </w:t>
+      </w:r>
+      <w:r>
+        <w:t xml:space="preserve">to find </w:t>
+      </w:r>
+      <w:r>
+        <w:t>a solution for Question</w:t>
+      </w:r>
+      <w:r>
+        <w:t xml:space="preserve"> 1</w:t>
+      </w:r>
+      <w:r>
+        <w:t xml:space="preserve">. </w:t>
+      </w:r>
+      <w:r>
+        <w:t>MiniZinc is a free and open-source constraint modeling language.</w:t>
+      </w:r>
+      <w:r>
         <w:t xml:space="preserve"> </w:t>
       </w:r>
-      <w:proofErr w:type="spellStart"/>
-      <w:r>
-        <w:t>M</w:t>
-      </w:r>
-      <w:r>
-        <w:t>ini</w:t>
-      </w:r>
-      <w:r>
-        <w:t>Z</w:t>
-      </w:r>
-      <w:r>
-        <w:t>inc</w:t>
-      </w:r>
-      <w:proofErr w:type="spellEnd"/>
-      <w:r>
-        <w:t xml:space="preserve"> program </w:t>
-      </w:r>
-      <w:r>
-        <w:t xml:space="preserve">to find </w:t>
-      </w:r>
-      <w:r>
-        <w:t>a solution for Question</w:t>
-      </w:r>
-      <w:r>
-        <w:t xml:space="preserve"> 1</w:t>
-      </w:r>
-      <w:r>
-        <w:t xml:space="preserve">. </w:t>
-      </w:r>
-      <w:proofErr w:type="spellStart"/>
-      <w:r>
-        <w:t>MiniZinc</w:t>
-      </w:r>
-      <w:proofErr w:type="spellEnd"/>
-      <w:r>
-        <w:t xml:space="preserve"> is a free and open-source constraint modeling language.</w:t>
+      <w:r>
+        <w:t xml:space="preserve">For this question, you </w:t>
+      </w:r>
+      <w:r>
+        <w:t xml:space="preserve">first </w:t>
+      </w:r>
+      <w:r>
+        <w:t>need to watch the</w:t>
+      </w:r>
+      <w:r>
+        <w:t xml:space="preserve"> video -</w:t>
       </w:r>
       <w:r>
         <w:t xml:space="preserve"> </w:t>
       </w:r>
       <w:r>
-        <w:t xml:space="preserve">For this question, you </w:t>
-      </w:r>
-      <w:r>
-        <w:t xml:space="preserve">first </w:t>
-      </w:r>
-      <w:r>
-        <w:t>need to watch the</w:t>
-      </w:r>
-      <w:r>
-        <w:t xml:space="preserve"> video -</w:t>
+        <w:t>T</w:t>
+      </w:r>
+      <w:r>
+        <w:t xml:space="preserve">utorial </w:t>
+      </w:r>
+      <w:r>
+        <w:t>I</w:t>
+      </w:r>
+      <w:r>
+        <w:t>ntroduction to Minizinc</w:t>
+      </w:r>
+      <w:r>
+        <w:t xml:space="preserve"> on D2L.</w:t>
       </w:r>
       <w:r>
         <w:t xml:space="preserve"> </w:t>
       </w:r>
       <w:r>
-        <w:t>T</w:t>
-      </w:r>
-      <w:r>
-        <w:t xml:space="preserve">utorial </w:t>
-      </w:r>
-      <w:r>
-        <w:t>I</w:t>
-      </w:r>
-      <w:r>
-        <w:t xml:space="preserve">ntroduction to </w:t>
-      </w:r>
-      <w:proofErr w:type="spellStart"/>
-      <w:r>
-        <w:t>Minizinc</w:t>
-      </w:r>
-      <w:proofErr w:type="spellEnd"/>
-      <w:r>
-        <w:t xml:space="preserve"> on D2L.</w:t>
-      </w:r>
-      <w:r>
-        <w:t xml:space="preserve"> </w:t>
-      </w:r>
-      <w:r>
         <w:t xml:space="preserve">You </w:t>
       </w:r>
       <w:r>
         <w:t xml:space="preserve">can also watch other videos </w:t>
       </w:r>
       <w:r>
-        <w:t xml:space="preserve">I posted with the assignment to help you write your </w:t>
-      </w:r>
-      <w:proofErr w:type="spellStart"/>
-      <w:r>
-        <w:t>MiniZinc</w:t>
-      </w:r>
-      <w:proofErr w:type="spellEnd"/>
-      <w:r>
-        <w:t xml:space="preserve"> program. You </w:t>
+        <w:t xml:space="preserve">I posted with the assignment to help you write your MiniZinc program. You </w:t>
       </w:r>
       <w:r>
         <w:t xml:space="preserve">need to submit </w:t>
@@ -3263,11 +3064,9 @@
       <w:r>
         <w:t xml:space="preserve">your </w:t>
       </w:r>
-      <w:proofErr w:type="spellStart"/>
       <w:r>
         <w:t>MinZinc</w:t>
       </w:r>
-      <w:proofErr w:type="spellEnd"/>
       <w:r>
         <w:t xml:space="preserve"> program and its output.</w:t>
       </w:r>
@@ -3276,14 +3075,1719 @@
       <w:pPr>
         <w:jc w:val="both"/>
       </w:pPr>
-      <w:r>
-        <w:t xml:space="preserve"> </w:t>
-      </w:r>
-    </w:p>
-    <w:p>
-      <w:pPr>
-        <w:jc w:val="both"/>
-      </w:pPr>
+    </w:p>
+    <w:p>
+      <w:pPr>
+        <w:jc w:val="both"/>
+        <w:rPr>
+          <w:rFonts w:ascii="Times New Roman" w:hAnsi="Times New Roman" w:cs="Times New Roman"/>
+          <w:sz w:val="24"/>
+          <w:szCs w:val="24"/>
+        </w:rPr>
+      </w:pPr>
+      <w:r>
+        <w:rPr>
+          <w:rFonts w:ascii="Times New Roman" w:hAnsi="Times New Roman" w:cs="Times New Roman"/>
+          <w:sz w:val="24"/>
+          <w:szCs w:val="24"/>
+        </w:rPr>
+        <w:t>MiniZinc code (.mzn file submitted separately as well):</w:t>
+      </w:r>
+    </w:p>
+    <w:p>
+      <w:pPr>
+        <w:shd w:val="clear" w:color="auto" w:fill="F2F2F2" w:themeFill="background1" w:themeFillShade="F2"/>
+        <w:spacing w:line="240" w:lineRule="auto"/>
+        <w:jc w:val="both"/>
+        <w:rPr>
+          <w:rFonts w:ascii="Consolas" w:hAnsi="Consolas"/>
+          <w:sz w:val="16"/>
+          <w:szCs w:val="16"/>
+        </w:rPr>
+      </w:pPr>
+      <w:r>
+        <w:rPr>
+          <w:rFonts w:ascii="Consolas" w:hAnsi="Consolas"/>
+          <w:sz w:val="16"/>
+          <w:szCs w:val="16"/>
+        </w:rPr>
+        <w:t>% You are responsible for scheduling computer science classes that meet on Tuesday and Thursday.</w:t>
+      </w:r>
+    </w:p>
+    <w:p>
+      <w:pPr>
+        <w:shd w:val="clear" w:color="auto" w:fill="F2F2F2" w:themeFill="background1" w:themeFillShade="F2"/>
+        <w:spacing w:line="240" w:lineRule="auto"/>
+        <w:jc w:val="both"/>
+        <w:rPr>
+          <w:rFonts w:ascii="Consolas" w:hAnsi="Consolas"/>
+          <w:sz w:val="16"/>
+          <w:szCs w:val="16"/>
+        </w:rPr>
+      </w:pPr>
+      <w:r>
+        <w:rPr>
+          <w:rFonts w:ascii="Consolas" w:hAnsi="Consolas"/>
+          <w:sz w:val="16"/>
+          <w:szCs w:val="16"/>
+        </w:rPr>
+        <w:t>% There are 8 classes that meet on these days and 4 professors who will be teaching these classes in which each professor will teach two classes.</w:t>
+      </w:r>
+    </w:p>
+    <w:p>
+      <w:pPr>
+        <w:shd w:val="clear" w:color="auto" w:fill="F2F2F2" w:themeFill="background1" w:themeFillShade="F2"/>
+        <w:spacing w:line="240" w:lineRule="auto"/>
+        <w:jc w:val="both"/>
+        <w:rPr>
+          <w:rFonts w:ascii="Consolas" w:hAnsi="Consolas"/>
+          <w:sz w:val="16"/>
+          <w:szCs w:val="16"/>
+        </w:rPr>
+      </w:pPr>
+      <w:r>
+        <w:rPr>
+          <w:rFonts w:ascii="Consolas" w:hAnsi="Consolas"/>
+          <w:sz w:val="16"/>
+          <w:szCs w:val="16"/>
+        </w:rPr>
+        <w:t>% The classes are CMSC1200, CMSC1240, CMSC2040, CMSC3040, CMSC3100, CMSC3140, CMSC4000, CMSC4200.</w:t>
+      </w:r>
+    </w:p>
+    <w:p>
+      <w:pPr>
+        <w:shd w:val="clear" w:color="auto" w:fill="F2F2F2" w:themeFill="background1" w:themeFillShade="F2"/>
+        <w:spacing w:line="240" w:lineRule="auto"/>
+        <w:jc w:val="both"/>
+        <w:rPr>
+          <w:rFonts w:ascii="Consolas" w:hAnsi="Consolas"/>
+          <w:sz w:val="16"/>
+          <w:szCs w:val="16"/>
+        </w:rPr>
+      </w:pPr>
+      <w:r>
+        <w:rPr>
+          <w:rFonts w:ascii="Consolas" w:hAnsi="Consolas"/>
+          <w:sz w:val="16"/>
+          <w:szCs w:val="16"/>
+        </w:rPr>
+        <w:t>% Classes meeting times are during 4 time slots:  TU8:00-9:15AM, TU9:30-10:45AM, TU12:30-1:45PM, TU2:00-3:15PM.</w:t>
+      </w:r>
+    </w:p>
+    <w:p>
+      <w:pPr>
+        <w:shd w:val="clear" w:color="auto" w:fill="F2F2F2" w:themeFill="background1" w:themeFillShade="F2"/>
+        <w:spacing w:line="240" w:lineRule="auto"/>
+        <w:jc w:val="both"/>
+        <w:rPr>
+          <w:rFonts w:ascii="Consolas" w:hAnsi="Consolas"/>
+          <w:sz w:val="16"/>
+          <w:szCs w:val="16"/>
+        </w:rPr>
+      </w:pPr>
+      <w:r>
+        <w:rPr>
+          <w:rFonts w:ascii="Consolas" w:hAnsi="Consolas"/>
+          <w:sz w:val="16"/>
+          <w:szCs w:val="16"/>
+        </w:rPr>
+        <w:t>% The professors are:</w:t>
+      </w:r>
+    </w:p>
+    <w:p>
+      <w:pPr>
+        <w:shd w:val="clear" w:color="auto" w:fill="F2F2F2" w:themeFill="background1" w:themeFillShade="F2"/>
+        <w:spacing w:line="240" w:lineRule="auto"/>
+        <w:jc w:val="both"/>
+        <w:rPr>
+          <w:rFonts w:ascii="Consolas" w:hAnsi="Consolas"/>
+          <w:sz w:val="16"/>
+          <w:szCs w:val="16"/>
+        </w:rPr>
+      </w:pPr>
+      <w:r>
+        <w:rPr>
+          <w:rFonts w:ascii="Consolas" w:hAnsi="Consolas"/>
+          <w:sz w:val="16"/>
+          <w:szCs w:val="16"/>
+        </w:rPr>
+        <w:t>%</w:t>
+      </w:r>
+      <w:r>
+        <w:rPr>
+          <w:rFonts w:ascii="Consolas" w:hAnsi="Consolas"/>
+          <w:sz w:val="16"/>
+          <w:szCs w:val="16"/>
+        </w:rPr>
+        <w:tab/>
+        <w:t>Professor 1 who is qualified to teach classes CMSC1200, CMSC3040, CMSC4000, and CMSC4200. He cannot teach at 8:00-9:15am.</w:t>
+      </w:r>
+    </w:p>
+    <w:p>
+      <w:pPr>
+        <w:shd w:val="clear" w:color="auto" w:fill="F2F2F2" w:themeFill="background1" w:themeFillShade="F2"/>
+        <w:spacing w:line="240" w:lineRule="auto"/>
+        <w:jc w:val="both"/>
+        <w:rPr>
+          <w:rFonts w:ascii="Consolas" w:hAnsi="Consolas"/>
+          <w:sz w:val="16"/>
+          <w:szCs w:val="16"/>
+        </w:rPr>
+      </w:pPr>
+      <w:r>
+        <w:rPr>
+          <w:rFonts w:ascii="Consolas" w:hAnsi="Consolas"/>
+          <w:sz w:val="16"/>
+          <w:szCs w:val="16"/>
+        </w:rPr>
+        <w:t>%</w:t>
+      </w:r>
+      <w:r>
+        <w:rPr>
+          <w:rFonts w:ascii="Consolas" w:hAnsi="Consolas"/>
+          <w:sz w:val="16"/>
+          <w:szCs w:val="16"/>
+        </w:rPr>
+        <w:tab/>
+        <w:t>Professor 2 who is qualified to teach classes CMSC1200, CMSC1240, CMSC3040, CMSC3140, and CMSC4000. He cannot teach at 2:00-3:15pm.</w:t>
+      </w:r>
+    </w:p>
+    <w:p>
+      <w:pPr>
+        <w:shd w:val="clear" w:color="auto" w:fill="F2F2F2" w:themeFill="background1" w:themeFillShade="F2"/>
+        <w:spacing w:line="240" w:lineRule="auto"/>
+        <w:jc w:val="both"/>
+        <w:rPr>
+          <w:rFonts w:ascii="Consolas" w:hAnsi="Consolas"/>
+          <w:sz w:val="16"/>
+          <w:szCs w:val="16"/>
+        </w:rPr>
+      </w:pPr>
+      <w:r>
+        <w:rPr>
+          <w:rFonts w:ascii="Consolas" w:hAnsi="Consolas"/>
+          <w:sz w:val="16"/>
+          <w:szCs w:val="16"/>
+        </w:rPr>
+        <w:t>%</w:t>
+      </w:r>
+      <w:r>
+        <w:rPr>
+          <w:rFonts w:ascii="Consolas" w:hAnsi="Consolas"/>
+          <w:sz w:val="16"/>
+          <w:szCs w:val="16"/>
+        </w:rPr>
+        <w:tab/>
+        <w:t>Professor 3 who is qualified to teach classes CMSC1200 and CMSC3100.</w:t>
+      </w:r>
+    </w:p>
+    <w:p>
+      <w:pPr>
+        <w:shd w:val="clear" w:color="auto" w:fill="F2F2F2" w:themeFill="background1" w:themeFillShade="F2"/>
+        <w:spacing w:line="240" w:lineRule="auto"/>
+        <w:jc w:val="both"/>
+        <w:rPr>
+          <w:rFonts w:ascii="Consolas" w:hAnsi="Consolas"/>
+          <w:sz w:val="16"/>
+          <w:szCs w:val="16"/>
+        </w:rPr>
+      </w:pPr>
+      <w:r>
+        <w:rPr>
+          <w:rFonts w:ascii="Consolas" w:hAnsi="Consolas"/>
+          <w:sz w:val="16"/>
+          <w:szCs w:val="16"/>
+        </w:rPr>
+        <w:t>%</w:t>
+      </w:r>
+      <w:r>
+        <w:rPr>
+          <w:rFonts w:ascii="Consolas" w:hAnsi="Consolas"/>
+          <w:sz w:val="16"/>
+          <w:szCs w:val="16"/>
+        </w:rPr>
+        <w:tab/>
+        <w:t>Professor 4 who is qualified to teach classes CMSC1240, CMSC2040, and CMSC4200.</w:t>
+      </w:r>
+    </w:p>
+    <w:p>
+      <w:pPr>
+        <w:shd w:val="clear" w:color="auto" w:fill="F2F2F2" w:themeFill="background1" w:themeFillShade="F2"/>
+        <w:spacing w:line="240" w:lineRule="auto"/>
+        <w:jc w:val="both"/>
+        <w:rPr>
+          <w:rFonts w:ascii="Consolas" w:hAnsi="Consolas"/>
+          <w:sz w:val="16"/>
+          <w:szCs w:val="16"/>
+        </w:rPr>
+      </w:pPr>
+    </w:p>
+    <w:p>
+      <w:pPr>
+        <w:shd w:val="clear" w:color="auto" w:fill="F2F2F2" w:themeFill="background1" w:themeFillShade="F2"/>
+        <w:spacing w:line="240" w:lineRule="auto"/>
+        <w:jc w:val="both"/>
+        <w:rPr>
+          <w:rFonts w:ascii="Consolas" w:hAnsi="Consolas"/>
+          <w:sz w:val="16"/>
+          <w:szCs w:val="16"/>
+        </w:rPr>
+      </w:pPr>
+      <w:r>
+        <w:rPr>
+          <w:rFonts w:ascii="Consolas" w:hAnsi="Consolas"/>
+          <w:sz w:val="16"/>
+          <w:szCs w:val="16"/>
+        </w:rPr>
+        <w:t>%   Possible Classes, Times, and Professors</w:t>
+      </w:r>
+    </w:p>
+    <w:p>
+      <w:pPr>
+        <w:shd w:val="clear" w:color="auto" w:fill="F2F2F2" w:themeFill="background1" w:themeFillShade="F2"/>
+        <w:spacing w:line="240" w:lineRule="auto"/>
+        <w:jc w:val="both"/>
+        <w:rPr>
+          <w:rFonts w:ascii="Consolas" w:hAnsi="Consolas"/>
+          <w:sz w:val="16"/>
+          <w:szCs w:val="16"/>
+        </w:rPr>
+      </w:pPr>
+      <w:r>
+        <w:rPr>
+          <w:rFonts w:ascii="Consolas" w:hAnsi="Consolas"/>
+          <w:sz w:val="16"/>
+          <w:szCs w:val="16"/>
+        </w:rPr>
+        <w:t>enum CLASS = {CMSC1200, CMSC1240, CMSC2040, CMSC3040, CMSC3100, CMSC3140, CMSC4000, CMSC4200};</w:t>
+      </w:r>
+    </w:p>
+    <w:p>
+      <w:pPr>
+        <w:shd w:val="clear" w:color="auto" w:fill="F2F2F2" w:themeFill="background1" w:themeFillShade="F2"/>
+        <w:spacing w:line="240" w:lineRule="auto"/>
+        <w:jc w:val="both"/>
+        <w:rPr>
+          <w:rFonts w:ascii="Consolas" w:hAnsi="Consolas"/>
+          <w:sz w:val="16"/>
+          <w:szCs w:val="16"/>
+        </w:rPr>
+      </w:pPr>
+      <w:r>
+        <w:rPr>
+          <w:rFonts w:ascii="Consolas" w:hAnsi="Consolas"/>
+          <w:sz w:val="16"/>
+          <w:szCs w:val="16"/>
+        </w:rPr>
+        <w:t>enum TIME = {t_8to915, t_930to1045, t_1230to145, t_2to315};</w:t>
+      </w:r>
+    </w:p>
+    <w:p>
+      <w:pPr>
+        <w:shd w:val="clear" w:color="auto" w:fill="F2F2F2" w:themeFill="background1" w:themeFillShade="F2"/>
+        <w:spacing w:line="240" w:lineRule="auto"/>
+        <w:jc w:val="both"/>
+        <w:rPr>
+          <w:rFonts w:ascii="Consolas" w:hAnsi="Consolas"/>
+          <w:sz w:val="16"/>
+          <w:szCs w:val="16"/>
+        </w:rPr>
+      </w:pPr>
+      <w:r>
+        <w:rPr>
+          <w:rFonts w:ascii="Consolas" w:hAnsi="Consolas"/>
+          <w:sz w:val="16"/>
+          <w:szCs w:val="16"/>
+        </w:rPr>
+        <w:t>enum PROFESSOR = {P1, P2, P3, P4};</w:t>
+      </w:r>
+    </w:p>
+    <w:p>
+      <w:pPr>
+        <w:shd w:val="clear" w:color="auto" w:fill="F2F2F2" w:themeFill="background1" w:themeFillShade="F2"/>
+        <w:spacing w:line="240" w:lineRule="auto"/>
+        <w:jc w:val="both"/>
+        <w:rPr>
+          <w:rFonts w:ascii="Consolas" w:hAnsi="Consolas"/>
+          <w:sz w:val="16"/>
+          <w:szCs w:val="16"/>
+        </w:rPr>
+      </w:pPr>
+    </w:p>
+    <w:p>
+      <w:pPr>
+        <w:shd w:val="clear" w:color="auto" w:fill="F2F2F2" w:themeFill="background1" w:themeFillShade="F2"/>
+        <w:spacing w:line="240" w:lineRule="auto"/>
+        <w:jc w:val="both"/>
+        <w:rPr>
+          <w:rFonts w:ascii="Consolas" w:hAnsi="Consolas"/>
+          <w:sz w:val="16"/>
+          <w:szCs w:val="16"/>
+        </w:rPr>
+      </w:pPr>
+      <w:r>
+        <w:rPr>
+          <w:rFonts w:ascii="Consolas" w:hAnsi="Consolas"/>
+          <w:sz w:val="16"/>
+          <w:szCs w:val="16"/>
+        </w:rPr>
+        <w:t>%   Each class will get a time</w:t>
+      </w:r>
+    </w:p>
+    <w:p>
+      <w:pPr>
+        <w:shd w:val="clear" w:color="auto" w:fill="F2F2F2" w:themeFill="background1" w:themeFillShade="F2"/>
+        <w:spacing w:line="240" w:lineRule="auto"/>
+        <w:jc w:val="both"/>
+        <w:rPr>
+          <w:rFonts w:ascii="Consolas" w:hAnsi="Consolas"/>
+          <w:sz w:val="16"/>
+          <w:szCs w:val="16"/>
+        </w:rPr>
+      </w:pPr>
+      <w:r>
+        <w:rPr>
+          <w:rFonts w:ascii="Consolas" w:hAnsi="Consolas"/>
+          <w:sz w:val="16"/>
+          <w:szCs w:val="16"/>
+        </w:rPr>
+        <w:t>array[CLASS] of var TIME: class_time;</w:t>
+      </w:r>
+    </w:p>
+    <w:p>
+      <w:pPr>
+        <w:shd w:val="clear" w:color="auto" w:fill="F2F2F2" w:themeFill="background1" w:themeFillShade="F2"/>
+        <w:spacing w:line="240" w:lineRule="auto"/>
+        <w:jc w:val="both"/>
+        <w:rPr>
+          <w:rFonts w:ascii="Consolas" w:hAnsi="Consolas"/>
+          <w:sz w:val="16"/>
+          <w:szCs w:val="16"/>
+        </w:rPr>
+      </w:pPr>
+    </w:p>
+    <w:p>
+      <w:pPr>
+        <w:shd w:val="clear" w:color="auto" w:fill="F2F2F2" w:themeFill="background1" w:themeFillShade="F2"/>
+        <w:spacing w:line="240" w:lineRule="auto"/>
+        <w:jc w:val="both"/>
+        <w:rPr>
+          <w:rFonts w:ascii="Consolas" w:hAnsi="Consolas"/>
+          <w:sz w:val="16"/>
+          <w:szCs w:val="16"/>
+        </w:rPr>
+      </w:pPr>
+      <w:r>
+        <w:rPr>
+          <w:rFonts w:ascii="Consolas" w:hAnsi="Consolas"/>
+          <w:sz w:val="16"/>
+          <w:szCs w:val="16"/>
+        </w:rPr>
+        <w:t>%   Each class will get a professor</w:t>
+      </w:r>
+    </w:p>
+    <w:p>
+      <w:pPr>
+        <w:shd w:val="clear" w:color="auto" w:fill="F2F2F2" w:themeFill="background1" w:themeFillShade="F2"/>
+        <w:spacing w:line="240" w:lineRule="auto"/>
+        <w:jc w:val="both"/>
+        <w:rPr>
+          <w:rFonts w:ascii="Consolas" w:hAnsi="Consolas"/>
+          <w:sz w:val="16"/>
+          <w:szCs w:val="16"/>
+        </w:rPr>
+      </w:pPr>
+      <w:r>
+        <w:rPr>
+          <w:rFonts w:ascii="Consolas" w:hAnsi="Consolas"/>
+          <w:sz w:val="16"/>
+          <w:szCs w:val="16"/>
+        </w:rPr>
+        <w:t>array[CLASS] of var PROFESSOR: teaches;</w:t>
+      </w:r>
+    </w:p>
+    <w:p>
+      <w:pPr>
+        <w:shd w:val="clear" w:color="auto" w:fill="F2F2F2" w:themeFill="background1" w:themeFillShade="F2"/>
+        <w:spacing w:line="240" w:lineRule="auto"/>
+        <w:jc w:val="both"/>
+        <w:rPr>
+          <w:rFonts w:ascii="Consolas" w:hAnsi="Consolas"/>
+          <w:sz w:val="16"/>
+          <w:szCs w:val="16"/>
+        </w:rPr>
+      </w:pPr>
+    </w:p>
+    <w:p>
+      <w:pPr>
+        <w:shd w:val="clear" w:color="auto" w:fill="F2F2F2" w:themeFill="background1" w:themeFillShade="F2"/>
+        <w:spacing w:line="240" w:lineRule="auto"/>
+        <w:jc w:val="both"/>
+        <w:rPr>
+          <w:rFonts w:ascii="Consolas" w:hAnsi="Consolas"/>
+          <w:sz w:val="16"/>
+          <w:szCs w:val="16"/>
+        </w:rPr>
+      </w:pPr>
+      <w:r>
+        <w:rPr>
+          <w:rFonts w:ascii="Consolas" w:hAnsi="Consolas"/>
+          <w:sz w:val="16"/>
+          <w:szCs w:val="16"/>
+        </w:rPr>
+        <w:lastRenderedPageBreak/>
+        <w:t>%   Each professor teaches 2 classes</w:t>
+      </w:r>
+    </w:p>
+    <w:p>
+      <w:pPr>
+        <w:shd w:val="clear" w:color="auto" w:fill="F2F2F2" w:themeFill="background1" w:themeFillShade="F2"/>
+        <w:spacing w:line="240" w:lineRule="auto"/>
+        <w:jc w:val="both"/>
+        <w:rPr>
+          <w:rFonts w:ascii="Consolas" w:hAnsi="Consolas"/>
+          <w:sz w:val="16"/>
+          <w:szCs w:val="16"/>
+        </w:rPr>
+      </w:pPr>
+      <w:r>
+        <w:rPr>
+          <w:rFonts w:ascii="Consolas" w:hAnsi="Consolas"/>
+          <w:sz w:val="16"/>
+          <w:szCs w:val="16"/>
+        </w:rPr>
+        <w:t>constraint forall(p in PROFESSOR)(</w:t>
+      </w:r>
+    </w:p>
+    <w:p>
+      <w:pPr>
+        <w:shd w:val="clear" w:color="auto" w:fill="F2F2F2" w:themeFill="background1" w:themeFillShade="F2"/>
+        <w:spacing w:line="240" w:lineRule="auto"/>
+        <w:jc w:val="both"/>
+        <w:rPr>
+          <w:rFonts w:ascii="Consolas" w:hAnsi="Consolas"/>
+          <w:sz w:val="16"/>
+          <w:szCs w:val="16"/>
+        </w:rPr>
+      </w:pPr>
+      <w:r>
+        <w:rPr>
+          <w:rFonts w:ascii="Consolas" w:hAnsi="Consolas"/>
+          <w:sz w:val="16"/>
+          <w:szCs w:val="16"/>
+        </w:rPr>
+        <w:t xml:space="preserve">    count(teaches, p) == 2</w:t>
+      </w:r>
+    </w:p>
+    <w:p>
+      <w:pPr>
+        <w:shd w:val="clear" w:color="auto" w:fill="F2F2F2" w:themeFill="background1" w:themeFillShade="F2"/>
+        <w:spacing w:line="240" w:lineRule="auto"/>
+        <w:jc w:val="both"/>
+        <w:rPr>
+          <w:rFonts w:ascii="Consolas" w:hAnsi="Consolas"/>
+          <w:sz w:val="16"/>
+          <w:szCs w:val="16"/>
+        </w:rPr>
+      </w:pPr>
+      <w:r>
+        <w:rPr>
+          <w:rFonts w:ascii="Consolas" w:hAnsi="Consolas"/>
+          <w:sz w:val="16"/>
+          <w:szCs w:val="16"/>
+        </w:rPr>
+        <w:t>);</w:t>
+      </w:r>
+    </w:p>
+    <w:p>
+      <w:pPr>
+        <w:shd w:val="clear" w:color="auto" w:fill="F2F2F2" w:themeFill="background1" w:themeFillShade="F2"/>
+        <w:spacing w:line="240" w:lineRule="auto"/>
+        <w:jc w:val="both"/>
+        <w:rPr>
+          <w:rFonts w:ascii="Consolas" w:hAnsi="Consolas"/>
+          <w:sz w:val="16"/>
+          <w:szCs w:val="16"/>
+        </w:rPr>
+      </w:pPr>
+    </w:p>
+    <w:p>
+      <w:pPr>
+        <w:shd w:val="clear" w:color="auto" w:fill="F2F2F2" w:themeFill="background1" w:themeFillShade="F2"/>
+        <w:spacing w:line="240" w:lineRule="auto"/>
+        <w:jc w:val="both"/>
+        <w:rPr>
+          <w:rFonts w:ascii="Consolas" w:hAnsi="Consolas"/>
+          <w:sz w:val="16"/>
+          <w:szCs w:val="16"/>
+        </w:rPr>
+      </w:pPr>
+      <w:r>
+        <w:rPr>
+          <w:rFonts w:ascii="Consolas" w:hAnsi="Consolas"/>
+          <w:sz w:val="16"/>
+          <w:szCs w:val="16"/>
+        </w:rPr>
+        <w:t>%   No professor teaches two classes at same time</w:t>
+      </w:r>
+    </w:p>
+    <w:p>
+      <w:pPr>
+        <w:shd w:val="clear" w:color="auto" w:fill="F2F2F2" w:themeFill="background1" w:themeFillShade="F2"/>
+        <w:spacing w:line="240" w:lineRule="auto"/>
+        <w:jc w:val="both"/>
+        <w:rPr>
+          <w:rFonts w:ascii="Consolas" w:hAnsi="Consolas"/>
+          <w:sz w:val="16"/>
+          <w:szCs w:val="16"/>
+        </w:rPr>
+      </w:pPr>
+      <w:r>
+        <w:rPr>
+          <w:rFonts w:ascii="Consolas" w:hAnsi="Consolas"/>
+          <w:sz w:val="16"/>
+          <w:szCs w:val="16"/>
+        </w:rPr>
+        <w:t>constraint forall(c1, c2 in CLASS where c1 &lt; c2)(</w:t>
+      </w:r>
+    </w:p>
+    <w:p>
+      <w:pPr>
+        <w:shd w:val="clear" w:color="auto" w:fill="F2F2F2" w:themeFill="background1" w:themeFillShade="F2"/>
+        <w:spacing w:line="240" w:lineRule="auto"/>
+        <w:jc w:val="both"/>
+        <w:rPr>
+          <w:rFonts w:ascii="Consolas" w:hAnsi="Consolas"/>
+          <w:sz w:val="16"/>
+          <w:szCs w:val="16"/>
+        </w:rPr>
+      </w:pPr>
+      <w:r>
+        <w:rPr>
+          <w:rFonts w:ascii="Consolas" w:hAnsi="Consolas"/>
+          <w:sz w:val="16"/>
+          <w:szCs w:val="16"/>
+        </w:rPr>
+        <w:t xml:space="preserve">  (teaches[c1] == teaches[c2]) -&gt;</w:t>
+      </w:r>
+    </w:p>
+    <w:p>
+      <w:pPr>
+        <w:shd w:val="clear" w:color="auto" w:fill="F2F2F2" w:themeFill="background1" w:themeFillShade="F2"/>
+        <w:spacing w:line="240" w:lineRule="auto"/>
+        <w:jc w:val="both"/>
+        <w:rPr>
+          <w:rFonts w:ascii="Consolas" w:hAnsi="Consolas"/>
+          <w:sz w:val="16"/>
+          <w:szCs w:val="16"/>
+        </w:rPr>
+      </w:pPr>
+      <w:r>
+        <w:rPr>
+          <w:rFonts w:ascii="Consolas" w:hAnsi="Consolas"/>
+          <w:sz w:val="16"/>
+          <w:szCs w:val="16"/>
+        </w:rPr>
+        <w:t xml:space="preserve">  (class_time[c1] != class_time[c2])</w:t>
+      </w:r>
+    </w:p>
+    <w:p>
+      <w:pPr>
+        <w:shd w:val="clear" w:color="auto" w:fill="F2F2F2" w:themeFill="background1" w:themeFillShade="F2"/>
+        <w:spacing w:line="240" w:lineRule="auto"/>
+        <w:jc w:val="both"/>
+        <w:rPr>
+          <w:rFonts w:ascii="Consolas" w:hAnsi="Consolas"/>
+          <w:sz w:val="16"/>
+          <w:szCs w:val="16"/>
+        </w:rPr>
+      </w:pPr>
+      <w:r>
+        <w:rPr>
+          <w:rFonts w:ascii="Consolas" w:hAnsi="Consolas"/>
+          <w:sz w:val="16"/>
+          <w:szCs w:val="16"/>
+        </w:rPr>
+        <w:t>);</w:t>
+      </w:r>
+    </w:p>
+    <w:p>
+      <w:pPr>
+        <w:shd w:val="clear" w:color="auto" w:fill="F2F2F2" w:themeFill="background1" w:themeFillShade="F2"/>
+        <w:spacing w:line="240" w:lineRule="auto"/>
+        <w:jc w:val="both"/>
+        <w:rPr>
+          <w:rFonts w:ascii="Consolas" w:hAnsi="Consolas"/>
+          <w:sz w:val="16"/>
+          <w:szCs w:val="16"/>
+        </w:rPr>
+      </w:pPr>
+    </w:p>
+    <w:p>
+      <w:pPr>
+        <w:shd w:val="clear" w:color="auto" w:fill="F2F2F2" w:themeFill="background1" w:themeFillShade="F2"/>
+        <w:spacing w:line="240" w:lineRule="auto"/>
+        <w:jc w:val="both"/>
+        <w:rPr>
+          <w:rFonts w:ascii="Consolas" w:hAnsi="Consolas"/>
+          <w:sz w:val="16"/>
+          <w:szCs w:val="16"/>
+        </w:rPr>
+      </w:pPr>
+      <w:r>
+        <w:rPr>
+          <w:rFonts w:ascii="Consolas" w:hAnsi="Consolas"/>
+          <w:sz w:val="16"/>
+          <w:szCs w:val="16"/>
+        </w:rPr>
+        <w:t>%</w:t>
+      </w:r>
+      <w:r>
+        <w:rPr>
+          <w:rFonts w:ascii="Consolas" w:hAnsi="Consolas"/>
+          <w:sz w:val="16"/>
+          <w:szCs w:val="16"/>
+        </w:rPr>
+        <w:tab/>
+      </w:r>
+      <w:r>
+        <w:rPr>
+          <w:rFonts w:ascii="Consolas" w:hAnsi="Consolas"/>
+          <w:sz w:val="16"/>
+          <w:szCs w:val="16"/>
+        </w:rPr>
+        <w:t>Professor 1 who is qualified to teach classes CMSC1200, CMSC3040, CMSC4000, and CMSC4200. He cannot teach at 8:00-9:15am.</w:t>
+      </w:r>
+    </w:p>
+    <w:p>
+      <w:pPr>
+        <w:shd w:val="clear" w:color="auto" w:fill="F2F2F2" w:themeFill="background1" w:themeFillShade="F2"/>
+        <w:spacing w:line="240" w:lineRule="auto"/>
+        <w:jc w:val="both"/>
+        <w:rPr>
+          <w:rFonts w:ascii="Consolas" w:hAnsi="Consolas"/>
+          <w:sz w:val="16"/>
+          <w:szCs w:val="16"/>
+        </w:rPr>
+      </w:pPr>
+      <w:r>
+        <w:rPr>
+          <w:rFonts w:ascii="Consolas" w:hAnsi="Consolas"/>
+          <w:sz w:val="16"/>
+          <w:szCs w:val="16"/>
+        </w:rPr>
+        <w:t>constraint teaches[CMSC1240] != P1;</w:t>
+      </w:r>
+    </w:p>
+    <w:p>
+      <w:pPr>
+        <w:shd w:val="clear" w:color="auto" w:fill="F2F2F2" w:themeFill="background1" w:themeFillShade="F2"/>
+        <w:spacing w:line="240" w:lineRule="auto"/>
+        <w:jc w:val="both"/>
+        <w:rPr>
+          <w:rFonts w:ascii="Consolas" w:hAnsi="Consolas"/>
+          <w:sz w:val="16"/>
+          <w:szCs w:val="16"/>
+        </w:rPr>
+      </w:pPr>
+      <w:r>
+        <w:rPr>
+          <w:rFonts w:ascii="Consolas" w:hAnsi="Consolas"/>
+          <w:sz w:val="16"/>
+          <w:szCs w:val="16"/>
+        </w:rPr>
+        <w:t>constraint teaches[CMSC2040] != P1;</w:t>
+      </w:r>
+    </w:p>
+    <w:p>
+      <w:pPr>
+        <w:shd w:val="clear" w:color="auto" w:fill="F2F2F2" w:themeFill="background1" w:themeFillShade="F2"/>
+        <w:spacing w:line="240" w:lineRule="auto"/>
+        <w:jc w:val="both"/>
+        <w:rPr>
+          <w:rFonts w:ascii="Consolas" w:hAnsi="Consolas"/>
+          <w:sz w:val="16"/>
+          <w:szCs w:val="16"/>
+        </w:rPr>
+      </w:pPr>
+      <w:r>
+        <w:rPr>
+          <w:rFonts w:ascii="Consolas" w:hAnsi="Consolas"/>
+          <w:sz w:val="16"/>
+          <w:szCs w:val="16"/>
+        </w:rPr>
+        <w:t>constraint teaches[CMSC3100] != P1;</w:t>
+      </w:r>
+    </w:p>
+    <w:p>
+      <w:pPr>
+        <w:shd w:val="clear" w:color="auto" w:fill="F2F2F2" w:themeFill="background1" w:themeFillShade="F2"/>
+        <w:spacing w:line="240" w:lineRule="auto"/>
+        <w:jc w:val="both"/>
+        <w:rPr>
+          <w:rFonts w:ascii="Consolas" w:hAnsi="Consolas"/>
+          <w:sz w:val="16"/>
+          <w:szCs w:val="16"/>
+        </w:rPr>
+      </w:pPr>
+      <w:r>
+        <w:rPr>
+          <w:rFonts w:ascii="Consolas" w:hAnsi="Consolas"/>
+          <w:sz w:val="16"/>
+          <w:szCs w:val="16"/>
+        </w:rPr>
+        <w:t>constraint teaches[CMSC3140] != P1;</w:t>
+      </w:r>
+    </w:p>
+    <w:p>
+      <w:pPr>
+        <w:shd w:val="clear" w:color="auto" w:fill="F2F2F2" w:themeFill="background1" w:themeFillShade="F2"/>
+        <w:spacing w:line="240" w:lineRule="auto"/>
+        <w:jc w:val="both"/>
+        <w:rPr>
+          <w:rFonts w:ascii="Consolas" w:hAnsi="Consolas"/>
+          <w:sz w:val="16"/>
+          <w:szCs w:val="16"/>
+        </w:rPr>
+      </w:pPr>
+      <w:r>
+        <w:rPr>
+          <w:rFonts w:ascii="Consolas" w:hAnsi="Consolas"/>
+          <w:sz w:val="16"/>
+          <w:szCs w:val="16"/>
+        </w:rPr>
+        <w:t>constraint forall(c in CLASS)(</w:t>
+      </w:r>
+    </w:p>
+    <w:p>
+      <w:pPr>
+        <w:shd w:val="clear" w:color="auto" w:fill="F2F2F2" w:themeFill="background1" w:themeFillShade="F2"/>
+        <w:spacing w:line="240" w:lineRule="auto"/>
+        <w:jc w:val="both"/>
+        <w:rPr>
+          <w:rFonts w:ascii="Consolas" w:hAnsi="Consolas"/>
+          <w:sz w:val="16"/>
+          <w:szCs w:val="16"/>
+        </w:rPr>
+      </w:pPr>
+      <w:r>
+        <w:rPr>
+          <w:rFonts w:ascii="Consolas" w:hAnsi="Consolas"/>
+          <w:sz w:val="16"/>
+          <w:szCs w:val="16"/>
+        </w:rPr>
+        <w:t xml:space="preserve">    (teaches[c] == P1) -&gt; (class_time[c] != t_8to915)</w:t>
+      </w:r>
+    </w:p>
+    <w:p>
+      <w:pPr>
+        <w:shd w:val="clear" w:color="auto" w:fill="F2F2F2" w:themeFill="background1" w:themeFillShade="F2"/>
+        <w:spacing w:line="240" w:lineRule="auto"/>
+        <w:jc w:val="both"/>
+        <w:rPr>
+          <w:rFonts w:ascii="Consolas" w:hAnsi="Consolas"/>
+          <w:sz w:val="16"/>
+          <w:szCs w:val="16"/>
+        </w:rPr>
+      </w:pPr>
+      <w:r>
+        <w:rPr>
+          <w:rFonts w:ascii="Consolas" w:hAnsi="Consolas"/>
+          <w:sz w:val="16"/>
+          <w:szCs w:val="16"/>
+        </w:rPr>
+        <w:t>);</w:t>
+      </w:r>
+    </w:p>
+    <w:p>
+      <w:pPr>
+        <w:shd w:val="clear" w:color="auto" w:fill="F2F2F2" w:themeFill="background1" w:themeFillShade="F2"/>
+        <w:spacing w:line="240" w:lineRule="auto"/>
+        <w:jc w:val="both"/>
+        <w:rPr>
+          <w:rFonts w:ascii="Consolas" w:hAnsi="Consolas"/>
+          <w:sz w:val="16"/>
+          <w:szCs w:val="16"/>
+        </w:rPr>
+      </w:pPr>
+    </w:p>
+    <w:p>
+      <w:pPr>
+        <w:shd w:val="clear" w:color="auto" w:fill="F2F2F2" w:themeFill="background1" w:themeFillShade="F2"/>
+        <w:spacing w:line="240" w:lineRule="auto"/>
+        <w:jc w:val="both"/>
+        <w:rPr>
+          <w:rFonts w:ascii="Consolas" w:hAnsi="Consolas"/>
+          <w:sz w:val="16"/>
+          <w:szCs w:val="16"/>
+        </w:rPr>
+      </w:pPr>
+      <w:r>
+        <w:rPr>
+          <w:rFonts w:ascii="Consolas" w:hAnsi="Consolas"/>
+          <w:sz w:val="16"/>
+          <w:szCs w:val="16"/>
+        </w:rPr>
+        <w:t>%</w:t>
+      </w:r>
+      <w:r>
+        <w:rPr>
+          <w:rFonts w:ascii="Consolas" w:hAnsi="Consolas"/>
+          <w:sz w:val="16"/>
+          <w:szCs w:val="16"/>
+        </w:rPr>
+        <w:tab/>
+        <w:t>Professor 2 who is qualified to teach classes CMSC1200, CMSC1240, CMSC3040, CMSC3140, and CMSC4000. He cannot teach at 2:00-3:15pm.</w:t>
+      </w:r>
+    </w:p>
+    <w:p>
+      <w:pPr>
+        <w:shd w:val="clear" w:color="auto" w:fill="F2F2F2" w:themeFill="background1" w:themeFillShade="F2"/>
+        <w:spacing w:line="240" w:lineRule="auto"/>
+        <w:jc w:val="both"/>
+        <w:rPr>
+          <w:rFonts w:ascii="Consolas" w:hAnsi="Consolas"/>
+          <w:sz w:val="16"/>
+          <w:szCs w:val="16"/>
+        </w:rPr>
+      </w:pPr>
+      <w:r>
+        <w:rPr>
+          <w:rFonts w:ascii="Consolas" w:hAnsi="Consolas"/>
+          <w:sz w:val="16"/>
+          <w:szCs w:val="16"/>
+        </w:rPr>
+        <w:t>constraint teaches[CMSC2040] != P2;</w:t>
+      </w:r>
+    </w:p>
+    <w:p>
+      <w:pPr>
+        <w:shd w:val="clear" w:color="auto" w:fill="F2F2F2" w:themeFill="background1" w:themeFillShade="F2"/>
+        <w:spacing w:line="240" w:lineRule="auto"/>
+        <w:jc w:val="both"/>
+        <w:rPr>
+          <w:rFonts w:ascii="Consolas" w:hAnsi="Consolas"/>
+          <w:sz w:val="16"/>
+          <w:szCs w:val="16"/>
+        </w:rPr>
+      </w:pPr>
+      <w:r>
+        <w:rPr>
+          <w:rFonts w:ascii="Consolas" w:hAnsi="Consolas"/>
+          <w:sz w:val="16"/>
+          <w:szCs w:val="16"/>
+        </w:rPr>
+        <w:t>constraint teaches[CMSC3100] != P2;</w:t>
+      </w:r>
+    </w:p>
+    <w:p>
+      <w:pPr>
+        <w:shd w:val="clear" w:color="auto" w:fill="F2F2F2" w:themeFill="background1" w:themeFillShade="F2"/>
+        <w:spacing w:line="240" w:lineRule="auto"/>
+        <w:jc w:val="both"/>
+        <w:rPr>
+          <w:rFonts w:ascii="Consolas" w:hAnsi="Consolas"/>
+          <w:sz w:val="16"/>
+          <w:szCs w:val="16"/>
+        </w:rPr>
+      </w:pPr>
+      <w:r>
+        <w:rPr>
+          <w:rFonts w:ascii="Consolas" w:hAnsi="Consolas"/>
+          <w:sz w:val="16"/>
+          <w:szCs w:val="16"/>
+        </w:rPr>
+        <w:t>constraint teaches[CMSC4200] != P2;</w:t>
+      </w:r>
+    </w:p>
+    <w:p>
+      <w:pPr>
+        <w:shd w:val="clear" w:color="auto" w:fill="F2F2F2" w:themeFill="background1" w:themeFillShade="F2"/>
+        <w:spacing w:line="240" w:lineRule="auto"/>
+        <w:jc w:val="both"/>
+        <w:rPr>
+          <w:rFonts w:ascii="Consolas" w:hAnsi="Consolas"/>
+          <w:sz w:val="16"/>
+          <w:szCs w:val="16"/>
+        </w:rPr>
+      </w:pPr>
+      <w:r>
+        <w:rPr>
+          <w:rFonts w:ascii="Consolas" w:hAnsi="Consolas"/>
+          <w:sz w:val="16"/>
+          <w:szCs w:val="16"/>
+        </w:rPr>
+        <w:t>constraint forall(c in CLASS)(</w:t>
+      </w:r>
+    </w:p>
+    <w:p>
+      <w:pPr>
+        <w:shd w:val="clear" w:color="auto" w:fill="F2F2F2" w:themeFill="background1" w:themeFillShade="F2"/>
+        <w:spacing w:line="240" w:lineRule="auto"/>
+        <w:jc w:val="both"/>
+        <w:rPr>
+          <w:rFonts w:ascii="Consolas" w:hAnsi="Consolas"/>
+          <w:sz w:val="16"/>
+          <w:szCs w:val="16"/>
+        </w:rPr>
+      </w:pPr>
+      <w:r>
+        <w:rPr>
+          <w:rFonts w:ascii="Consolas" w:hAnsi="Consolas"/>
+          <w:sz w:val="16"/>
+          <w:szCs w:val="16"/>
+        </w:rPr>
+        <w:t xml:space="preserve">    (teaches[c] == P2) -&gt; (class_time[c] != t_2to315)</w:t>
+      </w:r>
+    </w:p>
+    <w:p>
+      <w:pPr>
+        <w:shd w:val="clear" w:color="auto" w:fill="F2F2F2" w:themeFill="background1" w:themeFillShade="F2"/>
+        <w:spacing w:line="240" w:lineRule="auto"/>
+        <w:jc w:val="both"/>
+        <w:rPr>
+          <w:rFonts w:ascii="Consolas" w:hAnsi="Consolas"/>
+          <w:sz w:val="16"/>
+          <w:szCs w:val="16"/>
+        </w:rPr>
+      </w:pPr>
+      <w:r>
+        <w:rPr>
+          <w:rFonts w:ascii="Consolas" w:hAnsi="Consolas"/>
+          <w:sz w:val="16"/>
+          <w:szCs w:val="16"/>
+        </w:rPr>
+        <w:t>);</w:t>
+      </w:r>
+    </w:p>
+    <w:p>
+      <w:pPr>
+        <w:shd w:val="clear" w:color="auto" w:fill="F2F2F2" w:themeFill="background1" w:themeFillShade="F2"/>
+        <w:spacing w:line="240" w:lineRule="auto"/>
+        <w:jc w:val="both"/>
+        <w:rPr>
+          <w:rFonts w:ascii="Consolas" w:hAnsi="Consolas"/>
+          <w:sz w:val="16"/>
+          <w:szCs w:val="16"/>
+        </w:rPr>
+      </w:pPr>
+    </w:p>
+    <w:p>
+      <w:pPr>
+        <w:shd w:val="clear" w:color="auto" w:fill="F2F2F2" w:themeFill="background1" w:themeFillShade="F2"/>
+        <w:spacing w:line="240" w:lineRule="auto"/>
+        <w:jc w:val="both"/>
+        <w:rPr>
+          <w:rFonts w:ascii="Consolas" w:hAnsi="Consolas"/>
+          <w:sz w:val="16"/>
+          <w:szCs w:val="16"/>
+        </w:rPr>
+      </w:pPr>
+      <w:r>
+        <w:rPr>
+          <w:rFonts w:ascii="Consolas" w:hAnsi="Consolas"/>
+          <w:sz w:val="16"/>
+          <w:szCs w:val="16"/>
+        </w:rPr>
+        <w:t>%</w:t>
+      </w:r>
+      <w:r>
+        <w:rPr>
+          <w:rFonts w:ascii="Consolas" w:hAnsi="Consolas"/>
+          <w:sz w:val="16"/>
+          <w:szCs w:val="16"/>
+        </w:rPr>
+        <w:tab/>
+        <w:t>Professor 3 who is qualified to teach classes CMSC1200 and CMSC3100.</w:t>
+      </w:r>
+    </w:p>
+    <w:p>
+      <w:pPr>
+        <w:shd w:val="clear" w:color="auto" w:fill="F2F2F2" w:themeFill="background1" w:themeFillShade="F2"/>
+        <w:spacing w:line="240" w:lineRule="auto"/>
+        <w:jc w:val="both"/>
+        <w:rPr>
+          <w:rFonts w:ascii="Consolas" w:hAnsi="Consolas"/>
+          <w:sz w:val="16"/>
+          <w:szCs w:val="16"/>
+        </w:rPr>
+      </w:pPr>
+      <w:r>
+        <w:rPr>
+          <w:rFonts w:ascii="Consolas" w:hAnsi="Consolas"/>
+          <w:sz w:val="16"/>
+          <w:szCs w:val="16"/>
+        </w:rPr>
+        <w:t>constraint teaches[CMSC1240] != P3;</w:t>
+      </w:r>
+    </w:p>
+    <w:p>
+      <w:pPr>
+        <w:shd w:val="clear" w:color="auto" w:fill="F2F2F2" w:themeFill="background1" w:themeFillShade="F2"/>
+        <w:spacing w:line="240" w:lineRule="auto"/>
+        <w:jc w:val="both"/>
+        <w:rPr>
+          <w:rFonts w:ascii="Consolas" w:hAnsi="Consolas"/>
+          <w:sz w:val="16"/>
+          <w:szCs w:val="16"/>
+        </w:rPr>
+      </w:pPr>
+      <w:r>
+        <w:rPr>
+          <w:rFonts w:ascii="Consolas" w:hAnsi="Consolas"/>
+          <w:sz w:val="16"/>
+          <w:szCs w:val="16"/>
+        </w:rPr>
+        <w:t>constraint teaches[CMSC2040] != P3;</w:t>
+      </w:r>
+    </w:p>
+    <w:p>
+      <w:pPr>
+        <w:shd w:val="clear" w:color="auto" w:fill="F2F2F2" w:themeFill="background1" w:themeFillShade="F2"/>
+        <w:spacing w:line="240" w:lineRule="auto"/>
+        <w:jc w:val="both"/>
+        <w:rPr>
+          <w:rFonts w:ascii="Consolas" w:hAnsi="Consolas"/>
+          <w:sz w:val="16"/>
+          <w:szCs w:val="16"/>
+        </w:rPr>
+      </w:pPr>
+      <w:r>
+        <w:rPr>
+          <w:rFonts w:ascii="Consolas" w:hAnsi="Consolas"/>
+          <w:sz w:val="16"/>
+          <w:szCs w:val="16"/>
+        </w:rPr>
+        <w:t>constraint teaches[CMSC3040] != P3;</w:t>
+      </w:r>
+    </w:p>
+    <w:p>
+      <w:pPr>
+        <w:shd w:val="clear" w:color="auto" w:fill="F2F2F2" w:themeFill="background1" w:themeFillShade="F2"/>
+        <w:spacing w:line="240" w:lineRule="auto"/>
+        <w:jc w:val="both"/>
+        <w:rPr>
+          <w:rFonts w:ascii="Consolas" w:hAnsi="Consolas"/>
+          <w:sz w:val="16"/>
+          <w:szCs w:val="16"/>
+        </w:rPr>
+      </w:pPr>
+      <w:r>
+        <w:rPr>
+          <w:rFonts w:ascii="Consolas" w:hAnsi="Consolas"/>
+          <w:sz w:val="16"/>
+          <w:szCs w:val="16"/>
+        </w:rPr>
+        <w:t>constraint teaches[CMSC3140] != P3;</w:t>
+      </w:r>
+    </w:p>
+    <w:p>
+      <w:pPr>
+        <w:shd w:val="clear" w:color="auto" w:fill="F2F2F2" w:themeFill="background1" w:themeFillShade="F2"/>
+        <w:spacing w:line="240" w:lineRule="auto"/>
+        <w:jc w:val="both"/>
+        <w:rPr>
+          <w:rFonts w:ascii="Consolas" w:hAnsi="Consolas"/>
+          <w:sz w:val="16"/>
+          <w:szCs w:val="16"/>
+        </w:rPr>
+      </w:pPr>
+      <w:r>
+        <w:rPr>
+          <w:rFonts w:ascii="Consolas" w:hAnsi="Consolas"/>
+          <w:sz w:val="16"/>
+          <w:szCs w:val="16"/>
+        </w:rPr>
+        <w:t>constraint teaches[CMSC4000] != P3;</w:t>
+      </w:r>
+    </w:p>
+    <w:p>
+      <w:pPr>
+        <w:shd w:val="clear" w:color="auto" w:fill="F2F2F2" w:themeFill="background1" w:themeFillShade="F2"/>
+        <w:spacing w:line="240" w:lineRule="auto"/>
+        <w:jc w:val="both"/>
+        <w:rPr>
+          <w:rFonts w:ascii="Consolas" w:hAnsi="Consolas"/>
+          <w:sz w:val="16"/>
+          <w:szCs w:val="16"/>
+        </w:rPr>
+      </w:pPr>
+      <w:r>
+        <w:rPr>
+          <w:rFonts w:ascii="Consolas" w:hAnsi="Consolas"/>
+          <w:sz w:val="16"/>
+          <w:szCs w:val="16"/>
+        </w:rPr>
+        <w:t>constraint teaches[CMSC4200] != P3;</w:t>
+      </w:r>
+    </w:p>
+    <w:p>
+      <w:pPr>
+        <w:shd w:val="clear" w:color="auto" w:fill="F2F2F2" w:themeFill="background1" w:themeFillShade="F2"/>
+        <w:spacing w:line="240" w:lineRule="auto"/>
+        <w:jc w:val="both"/>
+        <w:rPr>
+          <w:rFonts w:ascii="Consolas" w:hAnsi="Consolas"/>
+          <w:sz w:val="16"/>
+          <w:szCs w:val="16"/>
+        </w:rPr>
+      </w:pPr>
+    </w:p>
+    <w:p>
+      <w:pPr>
+        <w:shd w:val="clear" w:color="auto" w:fill="F2F2F2" w:themeFill="background1" w:themeFillShade="F2"/>
+        <w:spacing w:line="240" w:lineRule="auto"/>
+        <w:jc w:val="both"/>
+        <w:rPr>
+          <w:rFonts w:ascii="Consolas" w:hAnsi="Consolas"/>
+          <w:sz w:val="16"/>
+          <w:szCs w:val="16"/>
+        </w:rPr>
+      </w:pPr>
+      <w:r>
+        <w:rPr>
+          <w:rFonts w:ascii="Consolas" w:hAnsi="Consolas"/>
+          <w:sz w:val="16"/>
+          <w:szCs w:val="16"/>
+        </w:rPr>
+        <w:lastRenderedPageBreak/>
+        <w:t>%</w:t>
+      </w:r>
+      <w:r>
+        <w:rPr>
+          <w:rFonts w:ascii="Consolas" w:hAnsi="Consolas"/>
+          <w:sz w:val="16"/>
+          <w:szCs w:val="16"/>
+        </w:rPr>
+        <w:tab/>
+        <w:t>Professor 4 who is qualified to teach classes CMSC1240, CMSC2040, and CMSC4200.</w:t>
+      </w:r>
+    </w:p>
+    <w:p>
+      <w:pPr>
+        <w:shd w:val="clear" w:color="auto" w:fill="F2F2F2" w:themeFill="background1" w:themeFillShade="F2"/>
+        <w:spacing w:line="240" w:lineRule="auto"/>
+        <w:jc w:val="both"/>
+        <w:rPr>
+          <w:rFonts w:ascii="Consolas" w:hAnsi="Consolas"/>
+          <w:sz w:val="16"/>
+          <w:szCs w:val="16"/>
+        </w:rPr>
+      </w:pPr>
+      <w:r>
+        <w:rPr>
+          <w:rFonts w:ascii="Consolas" w:hAnsi="Consolas"/>
+          <w:sz w:val="16"/>
+          <w:szCs w:val="16"/>
+        </w:rPr>
+        <w:t>constraint teaches[CMSC1200] != P4;</w:t>
+      </w:r>
+    </w:p>
+    <w:p>
+      <w:pPr>
+        <w:shd w:val="clear" w:color="auto" w:fill="F2F2F2" w:themeFill="background1" w:themeFillShade="F2"/>
+        <w:spacing w:line="240" w:lineRule="auto"/>
+        <w:jc w:val="both"/>
+        <w:rPr>
+          <w:rFonts w:ascii="Consolas" w:hAnsi="Consolas"/>
+          <w:sz w:val="16"/>
+          <w:szCs w:val="16"/>
+        </w:rPr>
+      </w:pPr>
+      <w:r>
+        <w:rPr>
+          <w:rFonts w:ascii="Consolas" w:hAnsi="Consolas"/>
+          <w:sz w:val="16"/>
+          <w:szCs w:val="16"/>
+        </w:rPr>
+        <w:t>constraint teaches[CMSC3040] != P4;</w:t>
+      </w:r>
+    </w:p>
+    <w:p>
+      <w:pPr>
+        <w:shd w:val="clear" w:color="auto" w:fill="F2F2F2" w:themeFill="background1" w:themeFillShade="F2"/>
+        <w:spacing w:line="240" w:lineRule="auto"/>
+        <w:jc w:val="both"/>
+        <w:rPr>
+          <w:rFonts w:ascii="Consolas" w:hAnsi="Consolas"/>
+          <w:sz w:val="16"/>
+          <w:szCs w:val="16"/>
+        </w:rPr>
+      </w:pPr>
+      <w:r>
+        <w:rPr>
+          <w:rFonts w:ascii="Consolas" w:hAnsi="Consolas"/>
+          <w:sz w:val="16"/>
+          <w:szCs w:val="16"/>
+        </w:rPr>
+        <w:t>constraint teaches[CMSC3100] != P4;</w:t>
+      </w:r>
+    </w:p>
+    <w:p>
+      <w:pPr>
+        <w:shd w:val="clear" w:color="auto" w:fill="F2F2F2" w:themeFill="background1" w:themeFillShade="F2"/>
+        <w:spacing w:line="240" w:lineRule="auto"/>
+        <w:jc w:val="both"/>
+        <w:rPr>
+          <w:rFonts w:ascii="Consolas" w:hAnsi="Consolas"/>
+          <w:sz w:val="16"/>
+          <w:szCs w:val="16"/>
+        </w:rPr>
+      </w:pPr>
+      <w:r>
+        <w:rPr>
+          <w:rFonts w:ascii="Consolas" w:hAnsi="Consolas"/>
+          <w:sz w:val="16"/>
+          <w:szCs w:val="16"/>
+        </w:rPr>
+        <w:t>constraint teaches[CMSC3140] != P4;</w:t>
+      </w:r>
+    </w:p>
+    <w:p>
+      <w:pPr>
+        <w:shd w:val="clear" w:color="auto" w:fill="F2F2F2" w:themeFill="background1" w:themeFillShade="F2"/>
+        <w:spacing w:line="240" w:lineRule="auto"/>
+        <w:jc w:val="both"/>
+        <w:rPr>
+          <w:rFonts w:ascii="Consolas" w:hAnsi="Consolas"/>
+          <w:sz w:val="16"/>
+          <w:szCs w:val="16"/>
+        </w:rPr>
+      </w:pPr>
+      <w:r>
+        <w:rPr>
+          <w:rFonts w:ascii="Consolas" w:hAnsi="Consolas"/>
+          <w:sz w:val="16"/>
+          <w:szCs w:val="16"/>
+        </w:rPr>
+        <w:t>constraint teaches[CMSC4000] != P4;</w:t>
+      </w:r>
+    </w:p>
+    <w:p>
+      <w:pPr>
+        <w:shd w:val="clear" w:color="auto" w:fill="F2F2F2" w:themeFill="background1" w:themeFillShade="F2"/>
+        <w:spacing w:line="240" w:lineRule="auto"/>
+        <w:jc w:val="both"/>
+        <w:rPr>
+          <w:rFonts w:ascii="Consolas" w:hAnsi="Consolas"/>
+          <w:sz w:val="16"/>
+          <w:szCs w:val="16"/>
+        </w:rPr>
+      </w:pPr>
+    </w:p>
+    <w:p>
+      <w:pPr>
+        <w:shd w:val="clear" w:color="auto" w:fill="F2F2F2" w:themeFill="background1" w:themeFillShade="F2"/>
+        <w:spacing w:line="240" w:lineRule="auto"/>
+        <w:jc w:val="both"/>
+        <w:rPr>
+          <w:rFonts w:ascii="Consolas" w:hAnsi="Consolas"/>
+          <w:sz w:val="16"/>
+          <w:szCs w:val="16"/>
+        </w:rPr>
+      </w:pPr>
+      <w:r>
+        <w:rPr>
+          <w:rFonts w:ascii="Consolas" w:hAnsi="Consolas"/>
+          <w:sz w:val="16"/>
+          <w:szCs w:val="16"/>
+        </w:rPr>
+        <w:t>%   Solve the problem</w:t>
+      </w:r>
+    </w:p>
+    <w:p>
+      <w:pPr>
+        <w:shd w:val="clear" w:color="auto" w:fill="F2F2F2" w:themeFill="background1" w:themeFillShade="F2"/>
+        <w:spacing w:line="240" w:lineRule="auto"/>
+        <w:jc w:val="both"/>
+        <w:rPr>
+          <w:rFonts w:ascii="Consolas" w:hAnsi="Consolas"/>
+          <w:sz w:val="16"/>
+          <w:szCs w:val="16"/>
+        </w:rPr>
+      </w:pPr>
+      <w:r>
+        <w:rPr>
+          <w:rFonts w:ascii="Consolas" w:hAnsi="Consolas"/>
+          <w:sz w:val="16"/>
+          <w:szCs w:val="16"/>
+        </w:rPr>
+        <w:t>solve satisfy;</w:t>
+      </w:r>
+    </w:p>
+    <w:p>
+      <w:pPr>
+        <w:shd w:val="clear" w:color="auto" w:fill="F2F2F2" w:themeFill="background1" w:themeFillShade="F2"/>
+        <w:spacing w:line="240" w:lineRule="auto"/>
+        <w:jc w:val="both"/>
+        <w:rPr>
+          <w:rFonts w:ascii="Consolas" w:hAnsi="Consolas"/>
+          <w:sz w:val="16"/>
+          <w:szCs w:val="16"/>
+        </w:rPr>
+      </w:pPr>
+    </w:p>
+    <w:p>
+      <w:pPr>
+        <w:shd w:val="clear" w:color="auto" w:fill="F2F2F2" w:themeFill="background1" w:themeFillShade="F2"/>
+        <w:spacing w:line="240" w:lineRule="auto"/>
+        <w:jc w:val="both"/>
+        <w:rPr>
+          <w:rFonts w:ascii="Consolas" w:hAnsi="Consolas"/>
+          <w:sz w:val="16"/>
+          <w:szCs w:val="16"/>
+        </w:rPr>
+      </w:pPr>
+      <w:r>
+        <w:rPr>
+          <w:rFonts w:ascii="Consolas" w:hAnsi="Consolas"/>
+          <w:sz w:val="16"/>
+          <w:szCs w:val="16"/>
+        </w:rPr>
+        <w:t>%   Map times to more readble strings</w:t>
+      </w:r>
+    </w:p>
+    <w:p>
+      <w:pPr>
+        <w:shd w:val="clear" w:color="auto" w:fill="F2F2F2" w:themeFill="background1" w:themeFillShade="F2"/>
+        <w:spacing w:line="240" w:lineRule="auto"/>
+        <w:jc w:val="both"/>
+        <w:rPr>
+          <w:rFonts w:ascii="Consolas" w:hAnsi="Consolas"/>
+          <w:sz w:val="16"/>
+          <w:szCs w:val="16"/>
+        </w:rPr>
+      </w:pPr>
+      <w:r>
+        <w:rPr>
+          <w:rFonts w:ascii="Consolas" w:hAnsi="Consolas"/>
+          <w:sz w:val="16"/>
+          <w:szCs w:val="16"/>
+        </w:rPr>
+        <w:t>array[TIME] of string: time_names = [</w:t>
+      </w:r>
+    </w:p>
+    <w:p>
+      <w:pPr>
+        <w:shd w:val="clear" w:color="auto" w:fill="F2F2F2" w:themeFill="background1" w:themeFillShade="F2"/>
+        <w:spacing w:line="240" w:lineRule="auto"/>
+        <w:jc w:val="both"/>
+        <w:rPr>
+          <w:rFonts w:ascii="Consolas" w:hAnsi="Consolas"/>
+          <w:sz w:val="16"/>
+          <w:szCs w:val="16"/>
+        </w:rPr>
+      </w:pPr>
+      <w:r>
+        <w:rPr>
+          <w:rFonts w:ascii="Consolas" w:hAnsi="Consolas"/>
+          <w:sz w:val="16"/>
+          <w:szCs w:val="16"/>
+        </w:rPr>
+        <w:t xml:space="preserve">  "8:00-9:15AM",</w:t>
+      </w:r>
+    </w:p>
+    <w:p>
+      <w:pPr>
+        <w:shd w:val="clear" w:color="auto" w:fill="F2F2F2" w:themeFill="background1" w:themeFillShade="F2"/>
+        <w:spacing w:line="240" w:lineRule="auto"/>
+        <w:jc w:val="both"/>
+        <w:rPr>
+          <w:rFonts w:ascii="Consolas" w:hAnsi="Consolas"/>
+          <w:sz w:val="16"/>
+          <w:szCs w:val="16"/>
+        </w:rPr>
+      </w:pPr>
+      <w:r>
+        <w:rPr>
+          <w:rFonts w:ascii="Consolas" w:hAnsi="Consolas"/>
+          <w:sz w:val="16"/>
+          <w:szCs w:val="16"/>
+        </w:rPr>
+        <w:t xml:space="preserve">  "9:30-10:45AM",</w:t>
+      </w:r>
+    </w:p>
+    <w:p>
+      <w:pPr>
+        <w:shd w:val="clear" w:color="auto" w:fill="F2F2F2" w:themeFill="background1" w:themeFillShade="F2"/>
+        <w:spacing w:line="240" w:lineRule="auto"/>
+        <w:jc w:val="both"/>
+        <w:rPr>
+          <w:rFonts w:ascii="Consolas" w:hAnsi="Consolas"/>
+          <w:sz w:val="16"/>
+          <w:szCs w:val="16"/>
+        </w:rPr>
+      </w:pPr>
+      <w:r>
+        <w:rPr>
+          <w:rFonts w:ascii="Consolas" w:hAnsi="Consolas"/>
+          <w:sz w:val="16"/>
+          <w:szCs w:val="16"/>
+        </w:rPr>
+        <w:t xml:space="preserve">  "12:30-1:45PM",</w:t>
+      </w:r>
+    </w:p>
+    <w:p>
+      <w:pPr>
+        <w:shd w:val="clear" w:color="auto" w:fill="F2F2F2" w:themeFill="background1" w:themeFillShade="F2"/>
+        <w:spacing w:line="240" w:lineRule="auto"/>
+        <w:jc w:val="both"/>
+        <w:rPr>
+          <w:rFonts w:ascii="Consolas" w:hAnsi="Consolas"/>
+          <w:sz w:val="16"/>
+          <w:szCs w:val="16"/>
+        </w:rPr>
+      </w:pPr>
+      <w:r>
+        <w:rPr>
+          <w:rFonts w:ascii="Consolas" w:hAnsi="Consolas"/>
+          <w:sz w:val="16"/>
+          <w:szCs w:val="16"/>
+        </w:rPr>
+        <w:t xml:space="preserve">  "2:00-3:15PM"</w:t>
+      </w:r>
+    </w:p>
+    <w:p>
+      <w:pPr>
+        <w:shd w:val="clear" w:color="auto" w:fill="F2F2F2" w:themeFill="background1" w:themeFillShade="F2"/>
+        <w:spacing w:line="240" w:lineRule="auto"/>
+        <w:jc w:val="both"/>
+        <w:rPr>
+          <w:rFonts w:ascii="Consolas" w:hAnsi="Consolas"/>
+          <w:sz w:val="16"/>
+          <w:szCs w:val="16"/>
+        </w:rPr>
+      </w:pPr>
+      <w:r>
+        <w:rPr>
+          <w:rFonts w:ascii="Consolas" w:hAnsi="Consolas"/>
+          <w:sz w:val="16"/>
+          <w:szCs w:val="16"/>
+        </w:rPr>
+        <w:t>];</w:t>
+      </w:r>
+    </w:p>
+    <w:p>
+      <w:pPr>
+        <w:shd w:val="clear" w:color="auto" w:fill="F2F2F2" w:themeFill="background1" w:themeFillShade="F2"/>
+        <w:spacing w:line="240" w:lineRule="auto"/>
+        <w:jc w:val="both"/>
+        <w:rPr>
+          <w:rFonts w:ascii="Consolas" w:hAnsi="Consolas"/>
+          <w:sz w:val="16"/>
+          <w:szCs w:val="16"/>
+        </w:rPr>
+      </w:pPr>
+    </w:p>
+    <w:p>
+      <w:pPr>
+        <w:shd w:val="clear" w:color="auto" w:fill="F2F2F2" w:themeFill="background1" w:themeFillShade="F2"/>
+        <w:spacing w:line="240" w:lineRule="auto"/>
+        <w:jc w:val="both"/>
+        <w:rPr>
+          <w:rFonts w:ascii="Consolas" w:hAnsi="Consolas"/>
+          <w:sz w:val="16"/>
+          <w:szCs w:val="16"/>
+        </w:rPr>
+      </w:pPr>
+      <w:r>
+        <w:rPr>
+          <w:rFonts w:ascii="Consolas" w:hAnsi="Consolas"/>
+          <w:sz w:val="16"/>
+          <w:szCs w:val="16"/>
+        </w:rPr>
+        <w:t>%   Output</w:t>
+      </w:r>
+    </w:p>
+    <w:p>
+      <w:pPr>
+        <w:shd w:val="clear" w:color="auto" w:fill="F2F2F2" w:themeFill="background1" w:themeFillShade="F2"/>
+        <w:spacing w:line="240" w:lineRule="auto"/>
+        <w:jc w:val="both"/>
+        <w:rPr>
+          <w:rFonts w:ascii="Consolas" w:hAnsi="Consolas"/>
+          <w:sz w:val="16"/>
+          <w:szCs w:val="16"/>
+        </w:rPr>
+      </w:pPr>
+      <w:r>
+        <w:rPr>
+          <w:rFonts w:ascii="Consolas" w:hAnsi="Consolas"/>
+          <w:sz w:val="16"/>
+          <w:szCs w:val="16"/>
+        </w:rPr>
+        <w:t>output [</w:t>
+      </w:r>
+    </w:p>
+    <w:p>
+      <w:pPr>
+        <w:shd w:val="clear" w:color="auto" w:fill="F2F2F2" w:themeFill="background1" w:themeFillShade="F2"/>
+        <w:spacing w:line="240" w:lineRule="auto"/>
+        <w:jc w:val="both"/>
+        <w:rPr>
+          <w:rFonts w:ascii="Consolas" w:hAnsi="Consolas"/>
+          <w:sz w:val="16"/>
+          <w:szCs w:val="16"/>
+        </w:rPr>
+      </w:pPr>
+      <w:r>
+        <w:rPr>
+          <w:rFonts w:ascii="Consolas" w:hAnsi="Consolas"/>
+          <w:sz w:val="16"/>
+          <w:szCs w:val="16"/>
+        </w:rPr>
+        <w:t xml:space="preserve">  "Professor 1 Schedule: " ++ show([ (c, time_names[fix(class_time[c])]) | c in CLASS where fix(teaches[c]) == P1 ]) ++ "\n" ++</w:t>
+      </w:r>
+    </w:p>
+    <w:p>
+      <w:pPr>
+        <w:shd w:val="clear" w:color="auto" w:fill="F2F2F2" w:themeFill="background1" w:themeFillShade="F2"/>
+        <w:spacing w:line="240" w:lineRule="auto"/>
+        <w:jc w:val="both"/>
+        <w:rPr>
+          <w:rFonts w:ascii="Consolas" w:hAnsi="Consolas"/>
+          <w:sz w:val="16"/>
+          <w:szCs w:val="16"/>
+        </w:rPr>
+      </w:pPr>
+      <w:r>
+        <w:rPr>
+          <w:rFonts w:ascii="Consolas" w:hAnsi="Consolas"/>
+          <w:sz w:val="16"/>
+          <w:szCs w:val="16"/>
+        </w:rPr>
+        <w:t xml:space="preserve">  "Professor 2 Schedule: " ++ show([ (c, time_names[fix(class_time[c])]) | c in CLASS where fix(teaches[c]) == P2 ]) ++ "\n" ++</w:t>
+      </w:r>
+    </w:p>
+    <w:p>
+      <w:pPr>
+        <w:shd w:val="clear" w:color="auto" w:fill="F2F2F2" w:themeFill="background1" w:themeFillShade="F2"/>
+        <w:spacing w:line="240" w:lineRule="auto"/>
+        <w:jc w:val="both"/>
+        <w:rPr>
+          <w:rFonts w:ascii="Consolas" w:hAnsi="Consolas"/>
+          <w:sz w:val="16"/>
+          <w:szCs w:val="16"/>
+        </w:rPr>
+      </w:pPr>
+      <w:r>
+        <w:rPr>
+          <w:rFonts w:ascii="Consolas" w:hAnsi="Consolas"/>
+          <w:sz w:val="16"/>
+          <w:szCs w:val="16"/>
+        </w:rPr>
+        <w:t xml:space="preserve">  "Professor 3 Schedule: " ++ show([ (c, time_names[fix(class_time[c])]) | c in CLASS where fix(teaches[c]) == P3 ]) ++ "\n" ++</w:t>
+      </w:r>
+    </w:p>
+    <w:p>
+      <w:pPr>
+        <w:shd w:val="clear" w:color="auto" w:fill="F2F2F2" w:themeFill="background1" w:themeFillShade="F2"/>
+        <w:spacing w:line="240" w:lineRule="auto"/>
+        <w:jc w:val="both"/>
+        <w:rPr>
+          <w:rFonts w:ascii="Consolas" w:hAnsi="Consolas"/>
+          <w:sz w:val="16"/>
+          <w:szCs w:val="16"/>
+        </w:rPr>
+      </w:pPr>
+      <w:r>
+        <w:rPr>
+          <w:rFonts w:ascii="Consolas" w:hAnsi="Consolas"/>
+          <w:sz w:val="16"/>
+          <w:szCs w:val="16"/>
+        </w:rPr>
+        <w:t xml:space="preserve">  "Professor 4 Schedule: " ++ show([ (c, time_names[fix(class_time[c])]) | c in CLASS where fix(teaches[c]) == P4 ])</w:t>
+      </w:r>
+    </w:p>
+    <w:p>
+      <w:pPr>
+        <w:shd w:val="clear" w:color="auto" w:fill="F2F2F2" w:themeFill="background1" w:themeFillShade="F2"/>
+        <w:spacing w:line="240" w:lineRule="auto"/>
+        <w:jc w:val="both"/>
+        <w:rPr>
+          <w:rFonts w:ascii="Consolas" w:hAnsi="Consolas"/>
+          <w:sz w:val="16"/>
+          <w:szCs w:val="16"/>
+        </w:rPr>
+      </w:pPr>
+      <w:r>
+        <w:rPr>
+          <w:rFonts w:ascii="Consolas" w:hAnsi="Consolas"/>
+          <w:sz w:val="16"/>
+          <w:szCs w:val="16"/>
+        </w:rPr>
+        <w:t>];</w:t>
+      </w:r>
+    </w:p>
+    <w:p>
+      <w:pPr>
+        <w:jc w:val="both"/>
+        <w:rPr>
+          <w:rFonts w:ascii="Times New Roman" w:hAnsi="Times New Roman" w:cs="Times New Roman"/>
+          <w:sz w:val="24"/>
+          <w:szCs w:val="24"/>
+        </w:rPr>
+      </w:pPr>
+      <w:r>
+        <w:rPr>
+          <w:rFonts w:ascii="Times New Roman" w:hAnsi="Times New Roman" w:cs="Times New Roman"/>
+          <w:sz w:val="24"/>
+          <w:szCs w:val="24"/>
+        </w:rPr>
+        <w:t>Output:</w:t>
+      </w:r>
+    </w:p>
+    <w:p>
+      <w:pPr>
+        <w:jc w:val="both"/>
+        <w:rPr>
+          <w:rFonts w:ascii="Times New Roman" w:hAnsi="Times New Roman" w:cs="Times New Roman"/>
+          <w:sz w:val="24"/>
+          <w:szCs w:val="24"/>
+        </w:rPr>
+      </w:pPr>
+      <w:r>
+        <w:rPr>
+          <w:rFonts w:ascii="Times New Roman" w:hAnsi="Times New Roman" w:cs="Times New Roman"/>
+          <w:sz w:val="24"/>
+          <w:szCs w:val="24"/>
+        </w:rPr>
+        <w:drawing>
+          <wp:inline distT="0" distB="0" distL="0" distR="0" wp14:anchorId="7DA3BD60" wp14:editId="28BE477D">
+            <wp:extent cx="5943600" cy="1522095"/>
+            <wp:effectExtent l="0" t="0" r="0" b="1905"/>
+            <wp:docPr id="1227821386" name="Picture 1"/>
+            <wp:cNvGraphicFramePr>
+              <a:graphicFrameLocks xmlns:a="http://schemas.openxmlformats.org/drawingml/2006/main" noChangeAspect="1"/>
+            </wp:cNvGraphicFramePr>
+            <a:graphic xmlns:a="http://schemas.openxmlformats.org/drawingml/2006/main">
+              <a:graphicData uri="http://schemas.openxmlformats.org/drawingml/2006/picture">
+                <pic:pic xmlns:pic="http://schemas.openxmlformats.org/drawingml/2006/picture">
+                  <pic:nvPicPr>
+                    <pic:cNvPr id="1227821386" name=""/>
+                    <pic:cNvPicPr/>
+                  </pic:nvPicPr>
+                  <pic:blipFill>
+                    <a:blip r:embed="rId5"/>
+                    <a:stretch>
+                      <a:fillRect/>
+                    </a:stretch>
+                  </pic:blipFill>
+                  <pic:spPr>
+                    <a:xfrm>
+                      <a:off x="0" y="0"/>
+                      <a:ext cx="5943600" cy="1522095"/>
+                    </a:xfrm>
+                    <a:prstGeom prst="rect">
+                      <a:avLst/>
+                    </a:prstGeom>
+                  </pic:spPr>
+                </pic:pic>
+              </a:graphicData>
+            </a:graphic>
+          </wp:inline>
+        </w:drawing>
+      </w:r>
     </w:p>
     <w:p>
       <w:pPr>

</xml_diff>